<commit_message>
Add Idioms matching exercise to Intermediate End V1/V2 source docx
Co-Authored-By: Claude Sonnet 5 <noreply@anthropic.com>
</commit_message>
<xml_diff>
--- a/Mid and End course yangi  testlar Road Map/Road Map yangilanga test mid and end/Intermediate/Intermediate/End/Inter End V1.docx
+++ b/Mid and End course yangi  testlar Road Map/Road Map yangilanga test mid and end/Intermediate/Intermediate/End/Inter End V1.docx
@@ -9883,6 +9883,411 @@
     <w:p>
       <w:pPr>
         <w:pStyle w:val="HeadASection"/>
+      </w:pPr>
+      <w:r>
+        <w:t>Idioms</w:t>
+      </w:r>
+    </w:p>
+    <w:p>
+      <w:pPr>
+        <w:pStyle w:val="Rubric"/>
+      </w:pPr>
+      <w:r>
+        <w:t>13</w:t>
+      </w:r>
+      <w:r>
+        <w:tab/>
+      </w:r>
+      <w:r>
+        <w:t>Match the idioms (A–J) with their definitions (1–10).</w:t>
+      </w:r>
+    </w:p>
+    <w:p>
+      <w:pPr>
+        <w:pStyle w:val="Text"/>
+      </w:pPr>
+      <w:r>
+        <w:rPr>
+          <w:b/>
+        </w:rPr>
+        <w:t>A</w:t>
+      </w:r>
+      <w:r>
+        <w:tab/>
+      </w:r>
+      <w:r>
+        <w:t>be over the moon</w:t>
+      </w:r>
+    </w:p>
+    <w:p>
+      <w:pPr>
+        <w:pStyle w:val="Text"/>
+      </w:pPr>
+      <w:r>
+        <w:rPr>
+          <w:b/>
+        </w:rPr>
+        <w:t>B</w:t>
+      </w:r>
+      <w:r>
+        <w:tab/>
+      </w:r>
+      <w:r>
+        <w:t>drive someone up the wall</w:t>
+      </w:r>
+    </w:p>
+    <w:p>
+      <w:pPr>
+        <w:pStyle w:val="Text"/>
+      </w:pPr>
+      <w:r>
+        <w:rPr>
+          <w:b/>
+        </w:rPr>
+        <w:t>C</w:t>
+      </w:r>
+      <w:r>
+        <w:tab/>
+      </w:r>
+      <w:r>
+        <w:t>cost an arm and a leg</w:t>
+      </w:r>
+    </w:p>
+    <w:p>
+      <w:pPr>
+        <w:pStyle w:val="Text"/>
+      </w:pPr>
+      <w:r>
+        <w:rPr>
+          <w:b/>
+        </w:rPr>
+        <w:t>D</w:t>
+      </w:r>
+      <w:r>
+        <w:tab/>
+      </w:r>
+      <w:r>
+        <w:t>be a piece of cake</w:t>
+      </w:r>
+    </w:p>
+    <w:p>
+      <w:pPr>
+        <w:pStyle w:val="Text"/>
+      </w:pPr>
+      <w:r>
+        <w:rPr>
+          <w:b/>
+        </w:rPr>
+        <w:t>E</w:t>
+      </w:r>
+      <w:r>
+        <w:tab/>
+      </w:r>
+      <w:r>
+        <w:t>break the ice</w:t>
+      </w:r>
+    </w:p>
+    <w:p>
+      <w:pPr>
+        <w:pStyle w:val="Text"/>
+      </w:pPr>
+      <w:r>
+        <w:rPr>
+          <w:b/>
+        </w:rPr>
+        <w:t>F</w:t>
+      </w:r>
+      <w:r>
+        <w:tab/>
+      </w:r>
+      <w:r>
+        <w:t>have a heart of gold</w:t>
+      </w:r>
+    </w:p>
+    <w:p>
+      <w:pPr>
+        <w:pStyle w:val="Text"/>
+      </w:pPr>
+      <w:r>
+        <w:rPr>
+          <w:b/>
+        </w:rPr>
+        <w:t>G</w:t>
+      </w:r>
+      <w:r>
+        <w:tab/>
+      </w:r>
+      <w:r>
+        <w:t>be a bit under the weather</w:t>
+      </w:r>
+    </w:p>
+    <w:p>
+      <w:pPr>
+        <w:pStyle w:val="Text"/>
+      </w:pPr>
+      <w:r>
+        <w:rPr>
+          <w:b/>
+        </w:rPr>
+        <w:t>H</w:t>
+      </w:r>
+      <w:r>
+        <w:tab/>
+      </w:r>
+      <w:r>
+        <w:t>take someone’s breath away</w:t>
+      </w:r>
+    </w:p>
+    <w:p>
+      <w:pPr>
+        <w:pStyle w:val="Text"/>
+      </w:pPr>
+      <w:r>
+        <w:rPr>
+          <w:b/>
+        </w:rPr>
+        <w:t>I</w:t>
+      </w:r>
+      <w:r>
+        <w:tab/>
+      </w:r>
+      <w:r>
+        <w:t>be down in the dumps</w:t>
+      </w:r>
+    </w:p>
+    <w:p>
+      <w:pPr>
+        <w:pStyle w:val="Text"/>
+      </w:pPr>
+      <w:r>
+        <w:rPr>
+          <w:b/>
+        </w:rPr>
+        <w:t>J</w:t>
+      </w:r>
+      <w:r>
+        <w:tab/>
+      </w:r>
+      <w:r>
+        <w:t>get on someone’s nerves</w:t>
+      </w:r>
+    </w:p>
+    <w:p>
+      <w:pPr>
+        <w:pStyle w:val="Text"/>
+      </w:pPr>
+    </w:p>
+    <w:p>
+      <w:pPr>
+        <w:pStyle w:val="Text"/>
+      </w:pPr>
+      <w:r>
+        <w:rPr>
+          <w:b/>
+        </w:rPr>
+        <w:t>1</w:t>
+      </w:r>
+      <w:r>
+        <w:tab/>
+      </w:r>
+      <w:r>
+        <w:t>To make people feel more relaxed and willing to talk to each other. ___</w:t>
+      </w:r>
+      <w:r>
+        <w:t>E</w:t>
+      </w:r>
+    </w:p>
+    <w:p>
+      <w:pPr>
+        <w:pStyle w:val="Text"/>
+      </w:pPr>
+      <w:r>
+        <w:rPr>
+          <w:b/>
+        </w:rPr>
+        <w:t>2</w:t>
+      </w:r>
+      <w:r>
+        <w:tab/>
+      </w:r>
+      <w:r>
+        <w:t>To be very kind and caring. ___</w:t>
+      </w:r>
+      <w:r>
+        <w:t>F</w:t>
+      </w:r>
+    </w:p>
+    <w:p>
+      <w:pPr>
+        <w:pStyle w:val="Text"/>
+      </w:pPr>
+      <w:r>
+        <w:rPr>
+          <w:b/>
+        </w:rPr>
+        <w:t>3</w:t>
+      </w:r>
+      <w:r>
+        <w:tab/>
+      </w:r>
+      <w:r>
+        <w:t>To be slightly ill. ___</w:t>
+      </w:r>
+      <w:r>
+        <w:t>G</w:t>
+      </w:r>
+    </w:p>
+    <w:p>
+      <w:pPr>
+        <w:pStyle w:val="Text"/>
+      </w:pPr>
+      <w:r>
+        <w:rPr>
+          <w:b/>
+        </w:rPr>
+        <w:t>4</w:t>
+      </w:r>
+      <w:r>
+        <w:tab/>
+      </w:r>
+      <w:r>
+        <w:t>To be extremely happy. ___</w:t>
+      </w:r>
+      <w:r>
+        <w:t>A</w:t>
+      </w:r>
+    </w:p>
+    <w:p>
+      <w:pPr>
+        <w:pStyle w:val="Text"/>
+      </w:pPr>
+      <w:r>
+        <w:rPr>
+          <w:b/>
+        </w:rPr>
+        <w:t>5</w:t>
+      </w:r>
+      <w:r>
+        <w:tab/>
+      </w:r>
+      <w:r>
+        <w:t>To be very easy to do. ___</w:t>
+      </w:r>
+      <w:r>
+        <w:t>D</w:t>
+      </w:r>
+    </w:p>
+    <w:p>
+      <w:pPr>
+        <w:pStyle w:val="Text"/>
+      </w:pPr>
+      <w:r>
+        <w:rPr>
+          <w:b/>
+        </w:rPr>
+        <w:t>6</w:t>
+      </w:r>
+      <w:r>
+        <w:tab/>
+      </w:r>
+      <w:r>
+        <w:t>To make someone feel very annoyed. ___</w:t>
+      </w:r>
+      <w:r>
+        <w:t>B</w:t>
+      </w:r>
+    </w:p>
+    <w:p>
+      <w:pPr>
+        <w:pStyle w:val="Text"/>
+      </w:pPr>
+      <w:r>
+        <w:rPr>
+          <w:b/>
+        </w:rPr>
+        <w:t>7</w:t>
+      </w:r>
+      <w:r>
+        <w:tab/>
+      </w:r>
+      <w:r>
+        <w:t>To be very expensive. ___</w:t>
+      </w:r>
+      <w:r>
+        <w:t>C</w:t>
+      </w:r>
+    </w:p>
+    <w:p>
+      <w:pPr>
+        <w:pStyle w:val="Text"/>
+      </w:pPr>
+      <w:r>
+        <w:rPr>
+          <w:b/>
+        </w:rPr>
+        <w:t>8</w:t>
+      </w:r>
+      <w:r>
+        <w:tab/>
+      </w:r>
+      <w:r>
+        <w:t>To be very sad and without much interest in life. ___</w:t>
+      </w:r>
+      <w:r>
+        <w:t>I</w:t>
+      </w:r>
+    </w:p>
+    <w:p>
+      <w:pPr>
+        <w:pStyle w:val="Text"/>
+      </w:pPr>
+      <w:r>
+        <w:rPr>
+          <w:b/>
+        </w:rPr>
+        <w:t>9</w:t>
+      </w:r>
+      <w:r>
+        <w:tab/>
+      </w:r>
+      <w:r>
+        <w:t>To be extremely beautiful or impressive. ___</w:t>
+      </w:r>
+      <w:r>
+        <w:t>H</w:t>
+      </w:r>
+    </w:p>
+    <w:p>
+      <w:pPr>
+        <w:pStyle w:val="Text"/>
+      </w:pPr>
+      <w:r>
+        <w:rPr>
+          <w:b/>
+        </w:rPr>
+        <w:t>10</w:t>
+      </w:r>
+      <w:r>
+        <w:tab/>
+      </w:r>
+      <w:r>
+        <w:t>To annoy someone repeatedly. ___</w:t>
+      </w:r>
+      <w:r>
+        <w:t>J</w:t>
+      </w:r>
+    </w:p>
+    <w:p>
+      <w:pPr>
+        <w:pStyle w:val="ScoreBox"/>
+      </w:pPr>
+      <w:r>
+        <w:t>/10</w:t>
+      </w:r>
+    </w:p>
+    <w:p>
+      <w:pPr>
+        <w:pStyle w:val="HeadASection"/>
         <w:tabs>
           <w:tab w:val="left" w:pos="1560"/>
           <w:tab w:val="left" w:pos="3119"/>
@@ -9904,7 +10309,7 @@
         <w:ind w:left="142" w:hanging="142"/>
       </w:pPr>
       <w:r>
-        <w:t>13</w:t>
+        <w:t>14</w:t>
       </w:r>
       <w:r>
         <w:t xml:space="preserve"> </w:t>
@@ -10498,7 +10903,7 @@
           <w:b/>
           <w:bCs/>
         </w:rPr>
-        <w:t>14</w:t>
+        <w:t>15</w:t>
       </w:r>
       <w:r>
         <w:t xml:space="preserve"> </w:t>

</xml_diff>